<commit_message>
Implement latest account, onboarding and CRM feedback
</commit_message>
<xml_diff>
--- a/backend/src/agreement-assets/client-rent-collection-aug26.docx
+++ b/backend/src/agreement-assets/client-rent-collection-aug26.docx
@@ -1903,15 +1903,7 @@
                 <w:sz w:val="20"/>
                 <w:szCs w:val="20"/>
               </w:rPr>
-              <w:t xml:space="preserve">You must pay the deposit of £{{DEPOSIT}} in full to the Agent, Fleming Lettings &amp; Developments UK Limited, of Creative Industries Centre, Glaisher Drive, Wolverhampton Science Park, Wolverhampton, West Midlands, WV10 9TG, who will transfer it to the Landlord once cleared funds have been received. The Landlord will pay the deposit into a Government-approved tenancy deposit scheme, namely {{DEPOSIT_SCHEME}}, and will protect it there, within thirty (30) days of the date on which the cleared funds are received by the Landlord or by anyone receiving them on the Landlord’s behalf, including the Agent. The Landlord will give you the prescribed information about the scheme within that same 30-day period, in line with Clause 5.0 of this agreement. For the avoidance of doubt, the Agent has no ongoing role or liability in managing the deposit.</w:t>
-            </w:r>
-            <w:r>
-              <w:rPr>
-                <w:rFonts w:ascii="Arial" w:hAnsi="Arial" w:cs="Arial"/>
-                <w:sz w:val="20"/>
-                <w:szCs w:val="20"/>
-              </w:rPr>
-              <w:t/>
+              <w:t xml:space="preserve">You must pay the deposit of £{{DEPOSIT}} in full to the Agent, Fleming Lettings &amp; Developments UK Limited, of Creative Industries Centre, Glaisher Drive, Wolverhampton Science Park, Wolverhampton, West Midlands, WV10 9TG, who will transfer it to the Landlord once cleared funds have been received. The Landlord will pay the deposit into a Government-approved tenancy deposit scheme, and will protect it there, within thirty (30) days of the date on which the cleared funds are received by the Landlord or by anyone receiving them on the Landlord’s behalf, including the Agent. The Landlord will give you the prescribed information about the scheme within that same 30-day period, in line with Clause 5.0 of this agreement. For the avoidance of doubt, the Agent has no ongoing role or liability in managing the deposit.</w:t>
             </w:r>
             <w:r>
               <w:rPr>
@@ -1927,15 +1919,23 @@
                 <w:sz w:val="20"/>
                 <w:szCs w:val="20"/>
               </w:rPr>
-              <w:t/>
-            </w:r>
-            <w:r>
-              <w:rPr>
-                <w:rFonts w:ascii="Arial" w:hAnsi="Arial" w:cs="Arial"/>
-                <w:sz w:val="20"/>
-                <w:szCs w:val="20"/>
-              </w:rPr>
-              <w:t/>
+              <w:t xml:space="preserve"/>
+            </w:r>
+            <w:r>
+              <w:rPr>
+                <w:rFonts w:ascii="Arial" w:hAnsi="Arial" w:cs="Arial"/>
+                <w:sz w:val="20"/>
+                <w:szCs w:val="20"/>
+              </w:rPr>
+              <w:t xml:space="preserve"/>
+            </w:r>
+            <w:r>
+              <w:rPr>
+                <w:rFonts w:ascii="Arial" w:hAnsi="Arial" w:cs="Arial"/>
+                <w:sz w:val="20"/>
+                <w:szCs w:val="20"/>
+              </w:rPr>
+              <w:t xml:space="preserve"/>
             </w:r>
           </w:p>
           <w:p>
@@ -7176,7 +7176,7 @@
           <w:sz w:val="20"/>
           <w:szCs w:val="20"/>
         </w:rPr>
-        <w:t xml:space="preserve">•  5.2   The Landlord will pay the deposit into a Government-approved tenancy deposit scheme, namely {{DEPOSIT_SCHEME}}, and will protect it there, within 30 days of the date on which the cleared funds are received by the Landlord or by anyone receiving them on the Landlord’s behalf. The Landlord will give you the prescribed information about the scheme within that same 30-day period. The Landlord may transfer the deposit to another Government-approved scheme, and will tell you in writing if they do.</w:t>
+        <w:t xml:space="preserve">•  5.2   The Landlord will pay the deposit into a Government-approved tenancy deposit scheme, and will protect it there, within 30 days of the date on which the cleared funds are received by the Landlord or by anyone receiving them on the Landlord’s behalf. The Landlord will give you the prescribed information about the scheme within that same 30-day period. The Landlord may transfer the deposit to another Government-approved scheme, and will tell you in writing if they do.</w:t>
       </w:r>
       <w:r>
         <w:rPr>
@@ -7184,7 +7184,7 @@
           <w:sz w:val="20"/>
           <w:szCs w:val="20"/>
         </w:rPr>
-        <w:t/>
+        <w:t xml:space="preserve"/>
       </w:r>
       <w:r>
         <w:rPr>
@@ -7192,7 +7192,7 @@
           <w:sz w:val="20"/>
           <w:szCs w:val="20"/>
         </w:rPr>
-        <w:t/>
+        <w:t xml:space="preserve"/>
       </w:r>
     </w:p>
     <w:p>

</xml_diff>